<commit_message>
updated equations to remove F_std
</commit_message>
<xml_diff>
--- a/equations_docx.docx
+++ b/equations_docx.docx
@@ -276,14 +276,7 @@
                   <w:rFonts w:ascii="Cambria Math" w:eastAsiaTheme="minorEastAsia" w:hAnsi="Cambria Math" w:cstheme="minorHAnsi"/>
                   <w:color w:val="000000" w:themeColor="text1"/>
                 </w:rPr>
-                <m:t>0</m:t>
-              </m:r>
-              <m:r>
-                <w:rPr>
-                  <w:rFonts w:ascii="Cambria Math" w:eastAsiaTheme="minorEastAsia" w:hAnsi="Cambria Math" w:cstheme="minorHAnsi"/>
-                  <w:color w:val="000000" w:themeColor="text1"/>
-                </w:rPr>
-                <m:t>≤</m:t>
+                <m:t>0≤</m:t>
               </m:r>
               <m:r>
                 <m:rPr>
@@ -899,38 +892,16 @@
               </m:ctrlPr>
             </m:fPr>
             <m:num>
-              <m:sSub>
-                <m:sSubPr>
-                  <m:ctrlPr>
-                    <w:rPr>
-                      <w:rFonts w:ascii="Cambria Math" w:eastAsiaTheme="minorEastAsia" w:hAnsi="Cambria Math"/>
-                      <w:i/>
-                      <w:color w:val="000000" w:themeColor="text1"/>
-                    </w:rPr>
-                  </m:ctrlPr>
-                </m:sSubPr>
-                <m:e>
-                  <m:r>
-                    <m:rPr>
-                      <m:sty m:val="bi"/>
-                    </m:rPr>
-                    <w:rPr>
-                      <w:rFonts w:ascii="Cambria Math" w:eastAsiaTheme="minorEastAsia" w:hAnsi="Cambria Math"/>
-                      <w:color w:val="000000" w:themeColor="text1"/>
-                    </w:rPr>
-                    <m:t>F</m:t>
-                  </m:r>
-                </m:e>
-                <m:sub>
-                  <m:r>
-                    <w:rPr>
-                      <w:rFonts w:ascii="Cambria Math" w:eastAsiaTheme="minorEastAsia" w:hAnsi="Cambria Math"/>
-                      <w:color w:val="000000" w:themeColor="text1"/>
-                    </w:rPr>
-                    <m:t>STD</m:t>
-                  </m:r>
-                </m:sub>
-              </m:sSub>
+              <m:r>
+                <m:rPr>
+                  <m:sty m:val="bi"/>
+                </m:rPr>
+                <w:rPr>
+                  <w:rFonts w:ascii="Cambria Math" w:eastAsiaTheme="minorEastAsia" w:hAnsi="Cambria Math" w:cstheme="minorHAnsi"/>
+                  <w:color w:val="000000" w:themeColor="text1"/>
+                </w:rPr>
+                <m:t>p</m:t>
+              </m:r>
             </m:num>
             <m:den>
               <m:sSub>
@@ -967,16 +938,6 @@
               </m:sSub>
             </m:den>
           </m:f>
-          <m:r>
-            <m:rPr>
-              <m:sty m:val="bi"/>
-            </m:rPr>
-            <w:rPr>
-              <w:rFonts w:ascii="Cambria Math" w:eastAsiaTheme="minorEastAsia" w:hAnsi="Cambria Math" w:cstheme="minorHAnsi"/>
-              <w:color w:val="000000" w:themeColor="text1"/>
-            </w:rPr>
-            <m:t>p</m:t>
-          </m:r>
         </m:oMath>
       </m:oMathPara>
     </w:p>

</xml_diff>